<commit_message>
actualización de graficas en los docs
</commit_message>
<xml_diff>
--- a/Docs/Observaciones-Lab6.docx
+++ b/Docs/Observaciones-Lab6.docx
@@ -1835,6 +1835,7 @@
     <w:p>
       <w:pPr>
         <w:pStyle w:val="ListParagraph"/>
+        <w:keepNext/>
         <w:numPr>
           <w:ilvl w:val="0"/>
           <w:numId w:val="10"/>
@@ -1851,6 +1852,7 @@
           <w:rFonts w:ascii="Dax-Regular" w:hAnsi="Dax-Regular"/>
           <w:lang w:val="es-CO"/>
         </w:rPr>
+        <w:lastRenderedPageBreak/>
         <w:t xml:space="preserve">Comparación de memoria y tiempo de ejecución para </w:t>
       </w:r>
       <w:r>
@@ -1865,14 +1867,7 @@
           <w:rFonts w:ascii="Dax-Regular" w:hAnsi="Dax-Regular"/>
           <w:lang w:val="es-CO"/>
         </w:rPr>
-        <w:t>PROBING</w:t>
-      </w:r>
-      <w:r>
-        <w:rPr>
-          <w:rFonts w:ascii="Dax-Regular" w:hAnsi="Dax-Regular"/>
-          <w:lang w:val="es-CO"/>
-        </w:rPr>
-        <w:t xml:space="preserve"> y </w:t>
+        <w:t xml:space="preserve">PROBING y </w:t>
       </w:r>
       <w:r>
         <w:rPr>
@@ -1891,7 +1886,60 @@
     </w:p>
     <w:p>
       <w:pPr>
+        <w:ind w:left="720"/>
+        <w:jc w:val="center"/>
+      </w:pPr>
+      <w:r>
+        <w:rPr>
+          <w:noProof/>
+        </w:rPr>
+        <w:drawing>
+          <wp:inline distT="0" distB="0" distL="0" distR="0" wp14:anchorId="1B25E026" wp14:editId="4EE81648">
+            <wp:extent cx="4677138" cy="3393425"/>
+            <wp:effectExtent l="0" t="0" r="0" b="0"/>
+            <wp:docPr id="621997959" name="Picture 2"/>
+            <wp:cNvGraphicFramePr>
+              <a:graphicFrameLocks xmlns:a="http://schemas.openxmlformats.org/drawingml/2006/main" noChangeAspect="1"/>
+            </wp:cNvGraphicFramePr>
+            <a:graphic xmlns:a="http://schemas.openxmlformats.org/drawingml/2006/main">
+              <a:graphicData uri="http://schemas.openxmlformats.org/drawingml/2006/picture">
+                <pic:pic xmlns:pic="http://schemas.openxmlformats.org/drawingml/2006/picture">
+                  <pic:nvPicPr>
+                    <pic:cNvPr id="621997959" name=""/>
+                    <pic:cNvPicPr/>
+                  </pic:nvPicPr>
+                  <pic:blipFill>
+                    <a:blip r:embed="rId10" cstate="print">
+                      <a:extLst>
+                        <a:ext uri="{28A0092B-C50C-407E-A947-70E740481C1C}">
+                          <a14:useLocalDpi xmlns:a14="http://schemas.microsoft.com/office/drawing/2010/main" val="0"/>
+                        </a:ext>
+                      </a:extLst>
+                    </a:blip>
+                    <a:stretch>
+                      <a:fillRect/>
+                    </a:stretch>
+                  </pic:blipFill>
+                  <pic:spPr>
+                    <a:xfrm>
+                      <a:off x="0" y="0"/>
+                      <a:ext cx="4683027" cy="3397698"/>
+                    </a:xfrm>
+                    <a:prstGeom prst="rect">
+                      <a:avLst/>
+                    </a:prstGeom>
+                  </pic:spPr>
+                </pic:pic>
+              </a:graphicData>
+            </a:graphic>
+          </wp:inline>
+        </w:drawing>
+      </w:r>
+    </w:p>
+    <w:p>
+      <w:pPr>
         <w:pStyle w:val="ListParagraph"/>
+        <w:keepNext/>
         <w:numPr>
           <w:ilvl w:val="0"/>
           <w:numId w:val="10"/>
@@ -1955,6 +2003,58 @@
     </w:p>
     <w:p>
       <w:pPr>
+        <w:ind w:left="720"/>
+        <w:jc w:val="center"/>
+      </w:pPr>
+      <w:r>
+        <w:rPr>
+          <w:noProof/>
+        </w:rPr>
+        <w:drawing>
+          <wp:inline distT="0" distB="0" distL="0" distR="0" wp14:anchorId="7C8832C5" wp14:editId="5A1ABD96">
+            <wp:extent cx="4786186" cy="3472543"/>
+            <wp:effectExtent l="0" t="0" r="1905" b="0"/>
+            <wp:docPr id="2001831228" name="Picture 1"/>
+            <wp:cNvGraphicFramePr>
+              <a:graphicFrameLocks xmlns:a="http://schemas.openxmlformats.org/drawingml/2006/main" noChangeAspect="1"/>
+            </wp:cNvGraphicFramePr>
+            <a:graphic xmlns:a="http://schemas.openxmlformats.org/drawingml/2006/main">
+              <a:graphicData uri="http://schemas.openxmlformats.org/drawingml/2006/picture">
+                <pic:pic xmlns:pic="http://schemas.openxmlformats.org/drawingml/2006/picture">
+                  <pic:nvPicPr>
+                    <pic:cNvPr id="2001831228" name=""/>
+                    <pic:cNvPicPr/>
+                  </pic:nvPicPr>
+                  <pic:blipFill>
+                    <a:blip r:embed="rId11" cstate="print">
+                      <a:extLst>
+                        <a:ext uri="{28A0092B-C50C-407E-A947-70E740481C1C}">
+                          <a14:useLocalDpi xmlns:a14="http://schemas.microsoft.com/office/drawing/2010/main" val="0"/>
+                        </a:ext>
+                      </a:extLst>
+                    </a:blip>
+                    <a:stretch>
+                      <a:fillRect/>
+                    </a:stretch>
+                  </pic:blipFill>
+                  <pic:spPr>
+                    <a:xfrm>
+                      <a:off x="0" y="0"/>
+                      <a:ext cx="4790284" cy="3475516"/>
+                    </a:xfrm>
+                    <a:prstGeom prst="rect">
+                      <a:avLst/>
+                    </a:prstGeom>
+                  </pic:spPr>
+                </pic:pic>
+              </a:graphicData>
+            </a:graphic>
+          </wp:inline>
+        </w:drawing>
+      </w:r>
+    </w:p>
+    <w:p>
+      <w:pPr>
         <w:pStyle w:val="ListParagraph"/>
         <w:spacing w:after="0"/>
         <w:jc w:val="both"/>
@@ -1984,21 +2084,6 @@
     </w:p>
     <w:p>
       <w:pPr>
-        <w:rPr>
-          <w:rFonts w:ascii="Dax-Regular" w:hAnsi="Dax-Regular"/>
-          <w:lang w:val="es-CO"/>
-        </w:rPr>
-      </w:pPr>
-      <w:r>
-        <w:rPr>
-          <w:rFonts w:ascii="Dax-Regular" w:hAnsi="Dax-Regular"/>
-          <w:lang w:val="es-CO"/>
-        </w:rPr>
-        <w:br w:type="page"/>
-      </w:r>
-    </w:p>
-    <w:p>
-      <w:pPr>
         <w:pStyle w:val="Heading1"/>
         <w:rPr>
           <w:b/>
@@ -2006,6 +2091,13 @@
           <w:lang w:val="es-CO"/>
         </w:rPr>
       </w:pPr>
+      <w:r>
+        <w:rPr>
+          <w:rFonts w:ascii="Dax-Regular" w:hAnsi="Dax-Regular"/>
+          <w:lang w:val="es-CO"/>
+        </w:rPr>
+        <w:br w:type="page"/>
+      </w:r>
       <w:r>
         <w:rPr>
           <w:b/>
@@ -2700,12 +2792,12 @@
       </w:pPr>
     </w:p>
     <w:sectPr>
-      <w:headerReference w:type="even" r:id="rId10"/>
-      <w:headerReference w:type="default" r:id="rId11"/>
-      <w:footerReference w:type="even" r:id="rId12"/>
-      <w:footerReference w:type="default" r:id="rId13"/>
-      <w:headerReference w:type="first" r:id="rId14"/>
-      <w:footerReference w:type="first" r:id="rId15"/>
+      <w:headerReference w:type="even" r:id="rId12"/>
+      <w:headerReference w:type="default" r:id="rId13"/>
+      <w:footerReference w:type="even" r:id="rId14"/>
+      <w:footerReference w:type="default" r:id="rId15"/>
+      <w:headerReference w:type="first" r:id="rId16"/>
+      <w:footerReference w:type="first" r:id="rId17"/>
       <w:pgSz w:w="12240" w:h="15840"/>
       <w:pgMar w:top="1440" w:right="1440" w:bottom="1440" w:left="1440" w:header="720" w:footer="720" w:gutter="0"/>
       <w:cols w:space="720"/>

</xml_diff>